<commit_message>
docs: inclui os requisitos de pracas/mesas e situacao do item do pedido
- RF23 (Gerente cadastra e edita pracas e mesas) e RF24 (Garcom entrega ou cancela item)
- US22 e US23 correspondentes
- UC23 (Atualizar Situacao do Item do Pedido) e UC24 (Gerenciar Pracas e Mesas), com secao
  nova de Configuracao do Salao
- Matriz de rastreabilidade atualizada
</commit_message>
<xml_diff>
--- a/docs/requisitos/GASTRA_Casos_de_Uso.docx
+++ b/docs/requisitos/GASTRA_Casos_de_Uso.docx
@@ -1168,6 +1168,71 @@
           </w:p>
         </w:tc>
       </w:tr>
+      <w:tr>
+        <w:tc>
+          <w:tcPr>
+            <w:tcW w:w="900" w:type="dxa"/>
+            <w:vAlign w:val="center"/>
+          </w:tcPr>
+          <w:p>
+            <w:pPr>
+              <w:rPr>
+                <w:sz w:val="19"/>
+                <w:szCs w:val="19"/>
+              </w:rPr>
+            </w:pPr>
+            <w:r>
+              <w:rPr>
+                <w:sz w:val="19"/>
+                <w:szCs w:val="19"/>
+              </w:rPr>
+              <w:t>UC23</w:t>
+            </w:r>
+          </w:p>
+        </w:tc>
+        <w:tc>
+          <w:tcPr>
+            <w:tcW w:w="6041" w:type="dxa"/>
+            <w:vAlign w:val="center"/>
+          </w:tcPr>
+          <w:p>
+            <w:pPr>
+              <w:rPr>
+                <w:sz w:val="19"/>
+                <w:szCs w:val="19"/>
+              </w:rPr>
+            </w:pPr>
+            <w:r>
+              <w:rPr>
+                <w:sz w:val="19"/>
+                <w:szCs w:val="19"/>
+              </w:rPr>
+              <w:t>Atualizar Situação do Item do Pedido (entregar/cancelar)</w:t>
+            </w:r>
+          </w:p>
+        </w:tc>
+        <w:tc>
+          <w:tcPr>
+            <w:tcW w:w="2559" w:type="dxa"/>
+            <w:vAlign w:val="center"/>
+          </w:tcPr>
+          <w:p>
+            <w:pPr>
+              <w:rPr>
+                <w:sz w:val="19"/>
+                <w:szCs w:val="19"/>
+              </w:rPr>
+            </w:pPr>
+            <w:r>
+              <w:rPr>
+                <w:sz w:val="19"/>
+                <w:szCs w:val="19"/>
+              </w:rPr>
+              <w:t>Garçom</w:t>
+            </w:r>
+          </w:p>
+        </w:tc>
+      </w:tr>
     </w:tbl>
     <w:p>
       <w:pPr>
@@ -1848,6 +1913,187 @@
                 <w:szCs w:val="19"/>
               </w:rPr>
               <w:t>Cliente</w:t>
+            </w:r>
+          </w:p>
+        </w:tc>
+      </w:tr>
+    </w:tbl>
+    <w:p>
+      <w:pPr>
+        <w:spacing w:before="280" w:after="140"/>
+        <w:rPr>
+          <w:rFonts w:ascii="Calibri" w:eastAsia="Calibri" w:hAnsi="Calibri" w:cs="Calibri"/>
+          <w:b/>
+          <w:bCs/>
+          <w:color w:val="C00000"/>
+          <w:sz w:val="26"/>
+          <w:szCs w:val="26"/>
+        </w:rPr>
+      </w:pPr>
+      <w:r>
+        <w:rPr>
+          <w:rFonts w:ascii="Calibri" w:eastAsia="Calibri" w:hAnsi="Calibri" w:cs="Calibri"/>
+          <w:b/>
+          <w:bCs/>
+          <w:color w:val="C00000"/>
+          <w:sz w:val="26"/>
+          <w:szCs w:val="26"/>
+        </w:rPr>
+        <w:t>6. Configuração do Salão</w:t>
+      </w:r>
+      <w:r>
+        <w:rPr>
+          <w:rFonts w:ascii="Calibri" w:eastAsia="Calibri" w:hAnsi="Calibri" w:cs="Calibri"/>
+          <w:b/>
+          <w:bCs/>
+          <w:color w:val="C00000"/>
+          <w:sz w:val="26"/>
+          <w:szCs w:val="26"/>
+        </w:rPr>
+      </w:r>
+    </w:p>
+    <w:tbl>
+      <w:tblPr>
+        <w:tblW w:w="9500" w:type="dxa"/>
+        <w:tblBorders>
+          <w:top w:val="single" w:sz="4" w:space="0" w:color="auto"/>
+          <w:left w:val="single" w:sz="4" w:space="0" w:color="auto"/>
+          <w:bottom w:val="single" w:sz="4" w:space="0" w:color="auto"/>
+          <w:right w:val="single" w:sz="4" w:space="0" w:color="auto"/>
+          <w:insideH w:val="single" w:sz="4" w:space="0" w:color="auto"/>
+          <w:insideV w:val="single" w:sz="4" w:space="0" w:color="auto"/>
+        </w:tblBorders>
+        <w:tblCellMar>
+          <w:left w:w="10" w:type="dxa"/>
+          <w:right w:w="10" w:type="dxa"/>
+        </w:tblCellMar>
+        <w:tblLook w:val="04A0" w:firstRow="1" w:lastRow="0" w:firstColumn="1" w:lastColumn="0" w:noHBand="0" w:noVBand="1"/>
+      </w:tblPr>
+      <w:tblGrid>
+        <w:gridCol w:w="900"/>
+        <w:gridCol w:w="6041"/>
+        <w:gridCol w:w="2559"/>
+      </w:tblGrid>
+      <w:tr>
+        <w:trPr>
+          <w:tblHeader/>
+        </w:trPr>
+        <w:tc>
+          <w:tcPr>
+            <w:tcW w:w="900" w:type="dxa"/>
+            <w:shd w:val="clear" w:color="auto" w:fill="C00000"/>
+            <w:vAlign w:val="center"/>
+          </w:tcPr>
+          <w:p>
+            <w:r>
+              <w:rPr>
+                <w:b/>
+                <w:bCs/>
+                <w:color w:val="FFFFFF"/>
+                <w:sz w:val="19"/>
+                <w:szCs w:val="19"/>
+              </w:rPr>
+              <w:t>ID</w:t>
+            </w:r>
+          </w:p>
+        </w:tc>
+        <w:tc>
+          <w:tcPr>
+            <w:tcW w:w="6041" w:type="dxa"/>
+            <w:shd w:val="clear" w:color="auto" w:fill="C00000"/>
+            <w:vAlign w:val="center"/>
+          </w:tcPr>
+          <w:p>
+            <w:r>
+              <w:rPr>
+                <w:b/>
+                <w:bCs/>
+                <w:color w:val="FFFFFF"/>
+                <w:sz w:val="19"/>
+                <w:szCs w:val="19"/>
+              </w:rPr>
+              <w:t>Use Case</w:t>
+            </w:r>
+          </w:p>
+        </w:tc>
+        <w:tc>
+          <w:tcPr>
+            <w:tcW w:w="2559" w:type="dxa"/>
+            <w:shd w:val="clear" w:color="auto" w:fill="C00000"/>
+            <w:vAlign w:val="center"/>
+          </w:tcPr>
+          <w:p>
+            <w:r>
+              <w:rPr>
+                <w:b/>
+                <w:bCs/>
+                <w:color w:val="FFFFFF"/>
+                <w:sz w:val="19"/>
+                <w:szCs w:val="19"/>
+              </w:rPr>
+              <w:t>Ator(es)</w:t>
+            </w:r>
+          </w:p>
+        </w:tc>
+      </w:tr>
+      <w:tr>
+        <w:trPr>
+          <w:tblHeader/>
+        </w:trPr>
+        <w:tc>
+          <w:tcPr>
+            <w:tcW w:w="900" w:type="dxa"/>
+            <w:shd w:val="clear" w:color="auto" w:fill="C00000"/>
+            <w:vAlign w:val="center"/>
+          </w:tcPr>
+          <w:p>
+            <w:r>
+              <w:rPr>
+                <w:b/>
+                <w:bCs/>
+                <w:color w:val="FFFFFF"/>
+                <w:sz w:val="19"/>
+                <w:szCs w:val="19"/>
+              </w:rPr>
+              <w:t>UC24</w:t>
+            </w:r>
+          </w:p>
+        </w:tc>
+        <w:tc>
+          <w:tcPr>
+            <w:tcW w:w="6041" w:type="dxa"/>
+            <w:shd w:val="clear" w:color="auto" w:fill="C00000"/>
+            <w:vAlign w:val="center"/>
+          </w:tcPr>
+          <w:p>
+            <w:r>
+              <w:rPr>
+                <w:b/>
+                <w:bCs/>
+                <w:color w:val="FFFFFF"/>
+                <w:sz w:val="19"/>
+                <w:szCs w:val="19"/>
+              </w:rPr>
+              <w:t>Gerenciar Praças e Mesas (cadastrar/editar)</w:t>
+            </w:r>
+          </w:p>
+        </w:tc>
+        <w:tc>
+          <w:tcPr>
+            <w:tcW w:w="2559" w:type="dxa"/>
+            <w:shd w:val="clear" w:color="auto" w:fill="C00000"/>
+            <w:vAlign w:val="center"/>
+          </w:tcPr>
+          <w:p>
+            <w:r>
+              <w:rPr>
+                <w:b/>
+                <w:bCs/>
+                <w:color w:val="FFFFFF"/>
+                <w:sz w:val="19"/>
+                <w:szCs w:val="19"/>
+              </w:rPr>
+              <w:t>Gerente</w:t>
             </w:r>
           </w:p>
         </w:tc>

</xml_diff>

<commit_message>
docs(tg2): capítulo 4 (engenharia de software) em Markdown para revisão
- Requisitos com fonte, RF12 reprovado e por quê; casos de uso; 24 histórias com critérios de aceite e o
  teste que comprova cada um; modelagem do conceitual ao físico, normalização e mapa LGPD; arquitetura,
  camada analítica, decisões e prototipação. A avaliação de Nielsen fica marcada para preencher.
- Requisitos: UC25 na tabela do Cliente, US24 para o RF25, matriz e KPIs com o índice que inclui a avaliação.

Refs #200 #201 #202 #203
</commit_message>
<xml_diff>
--- a/docs/requisitos/GASTRA_Casos_de_Uso.docx
+++ b/docs/requisitos/GASTRA_Casos_de_Uso.docx
@@ -1917,6 +1917,68 @@
           </w:p>
         </w:tc>
       </w:tr>
+      <w:tr>
+        <w:trPr>
+          <w:tblHeader/>
+        </w:trPr>
+        <w:tc>
+          <w:tcPr>
+            <w:tcW w:w="900" w:type="dxa"/>
+            <w:shd w:val="clear" w:color="auto" w:fill="C00000"/>
+            <w:vAlign w:val="center"/>
+          </w:tcPr>
+          <w:p>
+            <w:r>
+              <w:rPr>
+                <w:b/>
+                <w:bCs/>
+                <w:color w:val="FFFFFF"/>
+                <w:sz w:val="19"/>
+                <w:szCs w:val="19"/>
+              </w:rPr>
+              <w:t>UC25</w:t>
+            </w:r>
+          </w:p>
+        </w:tc>
+        <w:tc>
+          <w:tcPr>
+            <w:tcW w:w="6041" w:type="dxa"/>
+            <w:shd w:val="clear" w:color="auto" w:fill="C00000"/>
+            <w:vAlign w:val="center"/>
+          </w:tcPr>
+          <w:p>
+            <w:r>
+              <w:rPr>
+                <w:b/>
+                <w:bCs/>
+                <w:color w:val="FFFFFF"/>
+                <w:sz w:val="19"/>
+                <w:szCs w:val="19"/>
+              </w:rPr>
+              <w:t>Avaliar o Atendimento</w:t>
+            </w:r>
+          </w:p>
+        </w:tc>
+        <w:tc>
+          <w:tcPr>
+            <w:tcW w:w="2559" w:type="dxa"/>
+            <w:shd w:val="clear" w:color="auto" w:fill="C00000"/>
+            <w:vAlign w:val="center"/>
+          </w:tcPr>
+          <w:p>
+            <w:r>
+              <w:rPr>
+                <w:b/>
+                <w:bCs/>
+                <w:color w:val="FFFFFF"/>
+                <w:sz w:val="19"/>
+                <w:szCs w:val="19"/>
+              </w:rPr>
+              <w:t>Cliente</w:t>
+            </w:r>
+          </w:p>
+        </w:tc>
+      </w:tr>
     </w:tbl>
     <w:p>
       <w:pPr>
@@ -2094,68 +2156,6 @@
                 <w:szCs w:val="19"/>
               </w:rPr>
               <w:t>Gerente</w:t>
-            </w:r>
-          </w:p>
-        </w:tc>
-      </w:tr>
-      <w:tr>
-        <w:trPr>
-          <w:tblHeader/>
-        </w:trPr>
-        <w:tc>
-          <w:tcPr>
-            <w:tcW w:w="900" w:type="dxa"/>
-            <w:shd w:val="clear" w:color="auto" w:fill="C00000"/>
-            <w:vAlign w:val="center"/>
-          </w:tcPr>
-          <w:p>
-            <w:r>
-              <w:rPr>
-                <w:b/>
-                <w:bCs/>
-                <w:color w:val="FFFFFF"/>
-                <w:sz w:val="19"/>
-                <w:szCs w:val="19"/>
-              </w:rPr>
-              <w:t>UC25</w:t>
-            </w:r>
-          </w:p>
-        </w:tc>
-        <w:tc>
-          <w:tcPr>
-            <w:tcW w:w="6041" w:type="dxa"/>
-            <w:shd w:val="clear" w:color="auto" w:fill="C00000"/>
-            <w:vAlign w:val="center"/>
-          </w:tcPr>
-          <w:p>
-            <w:r>
-              <w:rPr>
-                <w:b/>
-                <w:bCs/>
-                <w:color w:val="FFFFFF"/>
-                <w:sz w:val="19"/>
-                <w:szCs w:val="19"/>
-              </w:rPr>
-              <w:t>Avaliar o Atendimento</w:t>
-            </w:r>
-          </w:p>
-        </w:tc>
-        <w:tc>
-          <w:tcPr>
-            <w:tcW w:w="2559" w:type="dxa"/>
-            <w:shd w:val="clear" w:color="auto" w:fill="C00000"/>
-            <w:vAlign w:val="center"/>
-          </w:tcPr>
-          <w:p>
-            <w:r>
-              <w:rPr>
-                <w:b/>
-                <w:bCs/>
-                <w:color w:val="FFFFFF"/>
-                <w:sz w:val="19"/>
-                <w:szCs w:val="19"/>
-              </w:rPr>
-              <w:t>Cliente</w:t>
             </w:r>
           </w:p>
         </w:tc>

</xml_diff>